<commit_message>
modification de la requete pour la remplacer par celle des statistique
</commit_message>
<xml_diff>
--- a/BackEnd/SQL_adherent.docx
+++ b/BackEnd/SQL_adherent.docx
@@ -81,15 +81,7 @@
           <w:sz w:val="22"/>
           <w:szCs w:val="22"/>
         </w:rPr>
-        <w:t xml:space="preserve">Vérifie email déjà utilisé : </w:t>
-      </w:r>
-      <w:r>
-        <w:rPr>
-          <w:color w:val="0070C0"/>
-          <w:sz w:val="22"/>
-          <w:szCs w:val="22"/>
-        </w:rPr>
-        <w:t xml:space="preserve">SELECT * FROM </w:t>
+        <w:t xml:space="preserve">Vérifie email déjà utilisé : SELECT * FROM </w:t>
       </w:r>
       <w:proofErr w:type="spellStart"/>
       <w:r>
@@ -305,15 +297,7 @@
           <w:sz w:val="22"/>
           <w:szCs w:val="22"/>
         </w:rPr>
-        <w:t>ADHERENT</w:t>
-      </w:r>
-      <w:r>
-        <w:rPr>
-          <w:color w:val="0070C0"/>
-          <w:sz w:val="22"/>
-          <w:szCs w:val="22"/>
-        </w:rPr>
-        <w:t xml:space="preserve"> (</w:t>
+        <w:t>ADHERENT (</w:t>
       </w:r>
       <w:proofErr w:type="spellStart"/>
       <w:r>
@@ -1111,26 +1095,336 @@
           <w:color w:val="0070C0"/>
           <w:sz w:val="22"/>
           <w:szCs w:val="22"/>
-        </w:rPr>
-        <w:t xml:space="preserve">SELECT * </w:t>
-      </w:r>
-      <w:proofErr w:type="spellStart"/>
-      <w:r>
-        <w:rPr>
-          <w:color w:val="0070C0"/>
-          <w:sz w:val="22"/>
-          <w:szCs w:val="22"/>
-        </w:rPr>
-        <w:t>from</w:t>
-      </w:r>
-      <w:proofErr w:type="spellEnd"/>
-      <w:r>
-        <w:rPr>
-          <w:color w:val="0070C0"/>
-          <w:sz w:val="22"/>
-          <w:szCs w:val="22"/>
-        </w:rPr>
-        <w:t xml:space="preserve"> ADHERENT </w:t>
+          <w:u w:val="single"/>
+        </w:rPr>
+        <w:t xml:space="preserve">Afficher </w:t>
+      </w:r>
+      <w:r>
+        <w:rPr>
+          <w:color w:val="0070C0"/>
+          <w:sz w:val="22"/>
+          <w:szCs w:val="22"/>
+          <w:u w:val="single"/>
+        </w:rPr>
+        <w:t>la visualisation</w:t>
+      </w:r>
+      <w:r>
+        <w:rPr>
+          <w:color w:val="0070C0"/>
+          <w:sz w:val="22"/>
+          <w:szCs w:val="22"/>
+          <w:u w:val="single"/>
+        </w:rPr>
+        <w:t xml:space="preserve"> </w:t>
+      </w:r>
+      <w:r>
+        <w:rPr>
+          <w:color w:val="0070C0"/>
+          <w:sz w:val="22"/>
+          <w:szCs w:val="22"/>
+          <w:u w:val="single"/>
+        </w:rPr>
+        <w:t xml:space="preserve">des victoires, défaites… </w:t>
+      </w:r>
+      <w:r>
+        <w:rPr>
+          <w:color w:val="0070C0"/>
+          <w:sz w:val="22"/>
+          <w:szCs w:val="22"/>
+          <w:u w:val="single"/>
+        </w:rPr>
+        <w:t>:</w:t>
+      </w:r>
+      <w:r>
+        <w:rPr>
+          <w:color w:val="0070C0"/>
+          <w:sz w:val="22"/>
+          <w:szCs w:val="22"/>
+          <w:u w:val="single"/>
+        </w:rPr>
+        <w:br/>
+      </w:r>
+      <w:r>
+        <w:rPr>
+          <w:color w:val="0070C0"/>
+          <w:sz w:val="22"/>
+          <w:szCs w:val="22"/>
+        </w:rPr>
+        <w:t>SELECT COUNT(</w:t>
+      </w:r>
+      <w:proofErr w:type="spellStart"/>
+      <w:r>
+        <w:rPr>
+          <w:color w:val="0070C0"/>
+          <w:sz w:val="22"/>
+          <w:szCs w:val="22"/>
+        </w:rPr>
+        <w:t>m.id_match</w:t>
+      </w:r>
+      <w:proofErr w:type="spellEnd"/>
+      <w:r>
+        <w:rPr>
+          <w:color w:val="0070C0"/>
+          <w:sz w:val="22"/>
+          <w:szCs w:val="22"/>
+        </w:rPr>
+        <w:t xml:space="preserve">) AS </w:t>
+      </w:r>
+      <w:proofErr w:type="spellStart"/>
+      <w:r>
+        <w:rPr>
+          <w:color w:val="0070C0"/>
+          <w:sz w:val="22"/>
+          <w:szCs w:val="22"/>
+        </w:rPr>
+        <w:t>nombreMatch</w:t>
+      </w:r>
+      <w:proofErr w:type="spellEnd"/>
+      <w:r>
+        <w:rPr>
+          <w:color w:val="0070C0"/>
+          <w:sz w:val="22"/>
+          <w:szCs w:val="22"/>
+        </w:rPr>
+        <w:t xml:space="preserve"> , SUM(</w:t>
+      </w:r>
+      <w:proofErr w:type="spellStart"/>
+      <w:r>
+        <w:rPr>
+          <w:color w:val="0070C0"/>
+          <w:sz w:val="22"/>
+          <w:szCs w:val="22"/>
+        </w:rPr>
+        <w:t>m.nb_victoires</w:t>
+      </w:r>
+      <w:proofErr w:type="spellEnd"/>
+      <w:r>
+        <w:rPr>
+          <w:color w:val="0070C0"/>
+          <w:sz w:val="22"/>
+          <w:szCs w:val="22"/>
+        </w:rPr>
+        <w:t>) AS victoire , SUM(</w:t>
+      </w:r>
+      <w:proofErr w:type="spellStart"/>
+      <w:r>
+        <w:rPr>
+          <w:color w:val="0070C0"/>
+          <w:sz w:val="22"/>
+          <w:szCs w:val="22"/>
+        </w:rPr>
+        <w:t>m.nb_defaites</w:t>
+      </w:r>
+      <w:proofErr w:type="spellEnd"/>
+      <w:r>
+        <w:rPr>
+          <w:color w:val="0070C0"/>
+          <w:sz w:val="22"/>
+          <w:szCs w:val="22"/>
+        </w:rPr>
+        <w:t xml:space="preserve">) AS </w:t>
+      </w:r>
+      <w:proofErr w:type="spellStart"/>
+      <w:r>
+        <w:rPr>
+          <w:color w:val="0070C0"/>
+          <w:sz w:val="22"/>
+          <w:szCs w:val="22"/>
+        </w:rPr>
+        <w:t>defaite</w:t>
+      </w:r>
+      <w:proofErr w:type="spellEnd"/>
+      <w:r>
+        <w:rPr>
+          <w:color w:val="0070C0"/>
+          <w:sz w:val="22"/>
+          <w:szCs w:val="22"/>
+        </w:rPr>
+        <w:t xml:space="preserve"> , SUM(</w:t>
+      </w:r>
+      <w:proofErr w:type="spellStart"/>
+      <w:r>
+        <w:rPr>
+          <w:color w:val="0070C0"/>
+          <w:sz w:val="22"/>
+          <w:szCs w:val="22"/>
+        </w:rPr>
+        <w:t>m.nb_egalites</w:t>
+      </w:r>
+      <w:proofErr w:type="spellEnd"/>
+      <w:r>
+        <w:rPr>
+          <w:color w:val="0070C0"/>
+          <w:sz w:val="22"/>
+          <w:szCs w:val="22"/>
+        </w:rPr>
+        <w:t xml:space="preserve">) AS </w:t>
+      </w:r>
+      <w:proofErr w:type="spellStart"/>
+      <w:r>
+        <w:rPr>
+          <w:color w:val="0070C0"/>
+          <w:sz w:val="22"/>
+          <w:szCs w:val="22"/>
+        </w:rPr>
+        <w:t>egalite</w:t>
+      </w:r>
+      <w:proofErr w:type="spellEnd"/>
+      <w:r>
+        <w:rPr>
+          <w:color w:val="0070C0"/>
+          <w:sz w:val="22"/>
+          <w:szCs w:val="22"/>
+        </w:rPr>
+        <w:br/>
+      </w:r>
+      <w:r>
+        <w:rPr>
+          <w:color w:val="0070C0"/>
+          <w:sz w:val="22"/>
+          <w:szCs w:val="22"/>
+        </w:rPr>
+        <w:t>FROM match as m</w:t>
+      </w:r>
+      <w:r>
+        <w:rPr>
+          <w:color w:val="0070C0"/>
+          <w:sz w:val="22"/>
+          <w:szCs w:val="22"/>
+        </w:rPr>
+        <w:br/>
+      </w:r>
+      <w:r>
+        <w:rPr>
+          <w:color w:val="0070C0"/>
+          <w:sz w:val="22"/>
+          <w:szCs w:val="22"/>
+        </w:rPr>
+        <w:t xml:space="preserve">JOIN </w:t>
+      </w:r>
+      <w:proofErr w:type="spellStart"/>
+      <w:r>
+        <w:rPr>
+          <w:color w:val="0070C0"/>
+          <w:sz w:val="22"/>
+          <w:szCs w:val="22"/>
+        </w:rPr>
+        <w:t>reservation</w:t>
+      </w:r>
+      <w:proofErr w:type="spellEnd"/>
+      <w:r>
+        <w:rPr>
+          <w:color w:val="0070C0"/>
+          <w:sz w:val="22"/>
+          <w:szCs w:val="22"/>
+        </w:rPr>
+        <w:t xml:space="preserve"> r on </w:t>
+      </w:r>
+      <w:proofErr w:type="spellStart"/>
+      <w:r>
+        <w:rPr>
+          <w:color w:val="0070C0"/>
+          <w:sz w:val="22"/>
+          <w:szCs w:val="22"/>
+        </w:rPr>
+        <w:t>r.id_reservation</w:t>
+      </w:r>
+      <w:proofErr w:type="spellEnd"/>
+      <w:r>
+        <w:rPr>
+          <w:color w:val="0070C0"/>
+          <w:sz w:val="22"/>
+          <w:szCs w:val="22"/>
+        </w:rPr>
+        <w:t xml:space="preserve"> = </w:t>
+      </w:r>
+      <w:proofErr w:type="spellStart"/>
+      <w:r>
+        <w:rPr>
+          <w:color w:val="0070C0"/>
+          <w:sz w:val="22"/>
+          <w:szCs w:val="22"/>
+        </w:rPr>
+        <w:t>m.id_reservation</w:t>
+      </w:r>
+      <w:proofErr w:type="spellEnd"/>
+      <w:r>
+        <w:rPr>
+          <w:color w:val="0070C0"/>
+          <w:sz w:val="22"/>
+          <w:szCs w:val="22"/>
+        </w:rPr>
+        <w:br/>
+      </w:r>
+      <w:r>
+        <w:rPr>
+          <w:color w:val="0070C0"/>
+          <w:sz w:val="22"/>
+          <w:szCs w:val="22"/>
+        </w:rPr>
+        <w:t xml:space="preserve">JOIN </w:t>
+      </w:r>
+      <w:proofErr w:type="spellStart"/>
+      <w:r>
+        <w:rPr>
+          <w:color w:val="0070C0"/>
+          <w:sz w:val="22"/>
+          <w:szCs w:val="22"/>
+        </w:rPr>
+        <w:t>adherent_reservation</w:t>
+      </w:r>
+      <w:proofErr w:type="spellEnd"/>
+      <w:r>
+        <w:rPr>
+          <w:color w:val="0070C0"/>
+          <w:sz w:val="22"/>
+          <w:szCs w:val="22"/>
+        </w:rPr>
+        <w:t xml:space="preserve"> ad on </w:t>
+      </w:r>
+      <w:proofErr w:type="spellStart"/>
+      <w:r>
+        <w:rPr>
+          <w:color w:val="0070C0"/>
+          <w:sz w:val="22"/>
+          <w:szCs w:val="22"/>
+        </w:rPr>
+        <w:t>ad.id_reservation</w:t>
+      </w:r>
+      <w:proofErr w:type="spellEnd"/>
+      <w:r>
+        <w:rPr>
+          <w:color w:val="0070C0"/>
+          <w:sz w:val="22"/>
+          <w:szCs w:val="22"/>
+        </w:rPr>
+        <w:t xml:space="preserve"> =  </w:t>
+      </w:r>
+      <w:proofErr w:type="spellStart"/>
+      <w:r>
+        <w:rPr>
+          <w:color w:val="0070C0"/>
+          <w:sz w:val="22"/>
+          <w:szCs w:val="22"/>
+        </w:rPr>
+        <w:t>r.id_reservation</w:t>
+      </w:r>
+      <w:proofErr w:type="spellEnd"/>
+      <w:r>
+        <w:rPr>
+          <w:color w:val="0070C0"/>
+          <w:sz w:val="22"/>
+          <w:szCs w:val="22"/>
+        </w:rPr>
+        <w:t xml:space="preserve"> </w:t>
+      </w:r>
+      <w:r>
+        <w:rPr>
+          <w:color w:val="0070C0"/>
+          <w:sz w:val="22"/>
+          <w:szCs w:val="22"/>
+        </w:rPr>
+        <w:br/>
       </w:r>
       <w:proofErr w:type="spellStart"/>
       <w:r>
@@ -1157,270 +1451,24 @@
           <w:sz w:val="22"/>
           <w:szCs w:val="22"/>
         </w:rPr>
-        <w:t>id_adherent</w:t>
-      </w:r>
-      <w:proofErr w:type="spellEnd"/>
-      <w:r>
-        <w:rPr>
-          <w:color w:val="0070C0"/>
-          <w:sz w:val="22"/>
-          <w:szCs w:val="22"/>
-        </w:rPr>
-        <w:t xml:space="preserve"> = ?;</w:t>
-      </w:r>
-      <w:r>
-        <w:rPr>
-          <w:color w:val="0070C0"/>
-          <w:sz w:val="22"/>
-          <w:szCs w:val="22"/>
-        </w:rPr>
-        <w:br/>
-      </w:r>
-      <w:r>
-        <w:rPr>
-          <w:color w:val="0070C0"/>
-          <w:sz w:val="22"/>
-          <w:szCs w:val="22"/>
-          <w:u w:val="single"/>
-        </w:rPr>
-        <w:br/>
-      </w:r>
-      <w:r>
-        <w:rPr>
-          <w:color w:val="0070C0"/>
-          <w:sz w:val="22"/>
-          <w:szCs w:val="22"/>
-          <w:u w:val="single"/>
-        </w:rPr>
-        <w:t>nombre de match :</w:t>
-      </w:r>
-      <w:r>
-        <w:rPr>
-          <w:color w:val="0070C0"/>
-          <w:sz w:val="22"/>
-          <w:szCs w:val="22"/>
-        </w:rPr>
-        <w:t xml:space="preserve"> </w:t>
-      </w:r>
-      <w:r>
-        <w:rPr>
-          <w:color w:val="0070C0"/>
-          <w:sz w:val="22"/>
-          <w:szCs w:val="22"/>
-        </w:rPr>
-        <w:br/>
-      </w:r>
-      <w:r>
-        <w:rPr>
-          <w:color w:val="0070C0"/>
-          <w:sz w:val="20"/>
-          <w:szCs w:val="20"/>
-        </w:rPr>
-        <w:t xml:space="preserve">SELECT COUNT(*) AS </w:t>
-      </w:r>
-      <w:proofErr w:type="spellStart"/>
-      <w:r>
-        <w:rPr>
-          <w:color w:val="0070C0"/>
-          <w:sz w:val="20"/>
-          <w:szCs w:val="20"/>
-        </w:rPr>
-        <w:t>matchs_</w:t>
-      </w:r>
-      <w:r>
-        <w:rPr>
-          <w:color w:val="0070C0"/>
-          <w:sz w:val="20"/>
-          <w:szCs w:val="20"/>
-        </w:rPr>
-        <w:t>total_</w:t>
-      </w:r>
-      <w:r>
-        <w:rPr>
-          <w:color w:val="0070C0"/>
-          <w:sz w:val="20"/>
-          <w:szCs w:val="20"/>
-        </w:rPr>
-        <w:t>adherent</w:t>
-      </w:r>
-      <w:proofErr w:type="spellEnd"/>
-      <w:r>
-        <w:rPr>
-          <w:color w:val="0070C0"/>
-          <w:sz w:val="20"/>
-          <w:szCs w:val="20"/>
-        </w:rPr>
-        <w:br/>
-      </w:r>
-      <w:r>
-        <w:rPr>
-          <w:color w:val="0070C0"/>
-          <w:sz w:val="20"/>
-          <w:szCs w:val="20"/>
-        </w:rPr>
-        <w:t>FROM MATCH</w:t>
-      </w:r>
-      <w:r>
-        <w:rPr>
-          <w:color w:val="0070C0"/>
-          <w:sz w:val="20"/>
-          <w:szCs w:val="20"/>
-        </w:rPr>
-        <w:br/>
-      </w:r>
-      <w:r>
-        <w:rPr>
-          <w:color w:val="0070C0"/>
-          <w:sz w:val="20"/>
-          <w:szCs w:val="20"/>
-        </w:rPr>
-        <w:t xml:space="preserve">JOIN RESERVATION ON </w:t>
-      </w:r>
-      <w:proofErr w:type="spellStart"/>
-      <w:r>
-        <w:rPr>
-          <w:color w:val="0070C0"/>
-          <w:sz w:val="20"/>
-          <w:szCs w:val="20"/>
-        </w:rPr>
-        <w:t>MATCH.id_reservation</w:t>
-      </w:r>
-      <w:proofErr w:type="spellEnd"/>
-      <w:r>
-        <w:rPr>
-          <w:color w:val="0070C0"/>
-          <w:sz w:val="20"/>
-          <w:szCs w:val="20"/>
-        </w:rPr>
-        <w:t xml:space="preserve"> = </w:t>
-      </w:r>
-      <w:proofErr w:type="spellStart"/>
-      <w:r>
-        <w:rPr>
-          <w:color w:val="0070C0"/>
-          <w:sz w:val="20"/>
-          <w:szCs w:val="20"/>
-        </w:rPr>
-        <w:t>RESERVATION.id_reservation</w:t>
-      </w:r>
-      <w:proofErr w:type="spellEnd"/>
-      <w:r>
-        <w:rPr>
-          <w:color w:val="0070C0"/>
-          <w:sz w:val="20"/>
-          <w:szCs w:val="20"/>
-        </w:rPr>
-        <w:br/>
-      </w:r>
-      <w:r>
-        <w:rPr>
-          <w:color w:val="0070C0"/>
-          <w:sz w:val="20"/>
-          <w:szCs w:val="20"/>
-        </w:rPr>
-        <w:t xml:space="preserve">JOIN ADHERENT_RESERVATION ON </w:t>
-      </w:r>
-      <w:proofErr w:type="spellStart"/>
-      <w:r>
-        <w:rPr>
-          <w:color w:val="0070C0"/>
-          <w:sz w:val="20"/>
-          <w:szCs w:val="20"/>
-        </w:rPr>
-        <w:t>RESERVATION.id_reservation</w:t>
-      </w:r>
-      <w:proofErr w:type="spellEnd"/>
-      <w:r>
-        <w:rPr>
-          <w:color w:val="0070C0"/>
-          <w:sz w:val="20"/>
-          <w:szCs w:val="20"/>
-        </w:rPr>
-        <w:t xml:space="preserve"> =</w:t>
-      </w:r>
-      <w:r>
-        <w:rPr>
-          <w:color w:val="0070C0"/>
-          <w:sz w:val="20"/>
-          <w:szCs w:val="20"/>
-        </w:rPr>
-        <w:t xml:space="preserve"> </w:t>
-      </w:r>
-      <w:proofErr w:type="spellStart"/>
-      <w:r>
-        <w:rPr>
-          <w:color w:val="0070C0"/>
-          <w:sz w:val="20"/>
-          <w:szCs w:val="20"/>
-        </w:rPr>
-        <w:t>ADHERENT_RESERVATION.id_reservation</w:t>
-      </w:r>
-      <w:proofErr w:type="spellEnd"/>
-      <w:r>
-        <w:rPr>
-          <w:color w:val="0070C0"/>
-          <w:sz w:val="20"/>
-          <w:szCs w:val="20"/>
-        </w:rPr>
-        <w:br/>
-      </w:r>
-      <w:r>
-        <w:rPr>
-          <w:color w:val="0070C0"/>
-          <w:sz w:val="20"/>
-          <w:szCs w:val="20"/>
-        </w:rPr>
-        <w:t xml:space="preserve">WHERE </w:t>
-      </w:r>
-      <w:proofErr w:type="spellStart"/>
-      <w:r>
-        <w:rPr>
-          <w:color w:val="0070C0"/>
-          <w:sz w:val="20"/>
-          <w:szCs w:val="20"/>
-        </w:rPr>
-        <w:t>ADHERENT_RESERVATION.id_adherent</w:t>
-      </w:r>
-      <w:proofErr w:type="spellEnd"/>
-      <w:r>
-        <w:rPr>
-          <w:color w:val="0070C0"/>
-          <w:sz w:val="20"/>
-          <w:szCs w:val="20"/>
-        </w:rPr>
-        <w:t xml:space="preserve"> =</w:t>
-      </w:r>
-      <w:r>
-        <w:rPr>
-          <w:color w:val="0070C0"/>
-          <w:sz w:val="20"/>
-          <w:szCs w:val="20"/>
-        </w:rPr>
-        <w:t> ?</w:t>
-      </w:r>
-      <w:r>
-        <w:rPr>
-          <w:color w:val="0070C0"/>
-          <w:sz w:val="22"/>
-          <w:szCs w:val="22"/>
-        </w:rPr>
-        <w:t>;</w:t>
-      </w:r>
-      <w:r>
-        <w:rPr>
-          <w:color w:val="0070C0"/>
-          <w:sz w:val="22"/>
-          <w:szCs w:val="22"/>
-        </w:rPr>
-        <w:br/>
+        <w:t>adherent_reservation.id_adherent</w:t>
+      </w:r>
+      <w:proofErr w:type="spellEnd"/>
+      <w:r>
+        <w:rPr>
+          <w:color w:val="0070C0"/>
+          <w:sz w:val="22"/>
+          <w:szCs w:val="22"/>
+        </w:rPr>
+        <w:t xml:space="preserve"> = ? `</w:t>
       </w:r>
     </w:p>
     <w:p>
       <w:pPr>
         <w:rPr>
           <w:color w:val="0070C0"/>
-          <w:sz w:val="20"/>
-          <w:szCs w:val="20"/>
+          <w:sz w:val="22"/>
+          <w:szCs w:val="22"/>
         </w:rPr>
       </w:pPr>
       <w:r>
@@ -1428,18 +1476,44 @@
           <w:color w:val="0070C0"/>
           <w:sz w:val="22"/>
           <w:szCs w:val="22"/>
-          <w:u w:val="single"/>
-        </w:rPr>
-        <w:t>Nombre</w:t>
-      </w:r>
-      <w:r>
-        <w:rPr>
-          <w:color w:val="0070C0"/>
-          <w:sz w:val="22"/>
-          <w:szCs w:val="22"/>
-          <w:u w:val="single"/>
-        </w:rPr>
-        <w:t xml:space="preserve"> victoires :</w:t>
+        </w:rPr>
+        <w:br/>
+      </w:r>
+      <w:r>
+        <w:rPr>
+          <w:color w:val="0070C0"/>
+          <w:sz w:val="22"/>
+          <w:szCs w:val="22"/>
+          <w:u w:val="single"/>
+        </w:rPr>
+        <w:t>Afficher tableaux de score :</w:t>
+      </w:r>
+      <w:r>
+        <w:rPr>
+          <w:color w:val="0070C0"/>
+          <w:sz w:val="22"/>
+          <w:szCs w:val="22"/>
+        </w:rPr>
+        <w:br/>
+        <w:t xml:space="preserve">SELECT </w:t>
+      </w:r>
+      <w:proofErr w:type="spellStart"/>
+      <w:r>
+        <w:rPr>
+          <w:color w:val="0070C0"/>
+          <w:sz w:val="22"/>
+          <w:szCs w:val="22"/>
+        </w:rPr>
+        <w:t>RESERVATION.date_reservation</w:t>
+      </w:r>
+      <w:proofErr w:type="spellEnd"/>
+      <w:r>
+        <w:rPr>
+          <w:color w:val="0070C0"/>
+          <w:sz w:val="22"/>
+          <w:szCs w:val="22"/>
+        </w:rPr>
+        <w:t>,</w:t>
       </w:r>
       <w:r>
         <w:rPr>
@@ -1449,6 +1523,16 @@
         </w:rPr>
         <w:t xml:space="preserve"> </w:t>
       </w:r>
+      <w:proofErr w:type="spellStart"/>
+      <w:r>
+        <w:rPr>
+          <w:color w:val="0070C0"/>
+          <w:sz w:val="22"/>
+          <w:szCs w:val="22"/>
+        </w:rPr>
+        <w:t>MATCH.score</w:t>
+      </w:r>
+      <w:proofErr w:type="spellEnd"/>
       <w:r>
         <w:rPr>
           <w:color w:val="0070C0"/>
@@ -1456,76 +1540,69 @@
           <w:szCs w:val="22"/>
         </w:rPr>
         <w:br/>
-      </w:r>
-      <w:r>
-        <w:rPr>
-          <w:color w:val="0070C0"/>
-          <w:sz w:val="18"/>
-          <w:szCs w:val="18"/>
-        </w:rPr>
-        <w:t>SELECT SUM(</w:t>
-      </w:r>
-      <w:proofErr w:type="spellStart"/>
-      <w:r>
-        <w:rPr>
-          <w:color w:val="0070C0"/>
-          <w:sz w:val="18"/>
-          <w:szCs w:val="18"/>
-        </w:rPr>
-        <w:t>MATCH.nb_victoires</w:t>
-      </w:r>
-      <w:proofErr w:type="spellEnd"/>
-      <w:r>
-        <w:rPr>
-          <w:color w:val="0070C0"/>
-          <w:sz w:val="18"/>
-          <w:szCs w:val="18"/>
-        </w:rPr>
-        <w:t xml:space="preserve">) AS </w:t>
-      </w:r>
-      <w:proofErr w:type="spellStart"/>
-      <w:r>
-        <w:rPr>
-          <w:color w:val="0070C0"/>
-          <w:sz w:val="18"/>
-          <w:szCs w:val="18"/>
-        </w:rPr>
-        <w:t>total_victoires</w:t>
-      </w:r>
-      <w:proofErr w:type="spellEnd"/>
-      <w:r>
-        <w:rPr>
-          <w:color w:val="0070C0"/>
-          <w:sz w:val="18"/>
-          <w:szCs w:val="18"/>
+        <w:t>FROM RESERVATION</w:t>
+      </w:r>
+      <w:r>
+        <w:rPr>
+          <w:color w:val="0070C0"/>
+          <w:sz w:val="22"/>
+          <w:szCs w:val="22"/>
         </w:rPr>
         <w:br/>
-        <w:t>FROM MATCH</w:t>
-      </w:r>
-      <w:r>
-        <w:rPr>
-          <w:color w:val="0070C0"/>
-          <w:sz w:val="18"/>
-          <w:szCs w:val="18"/>
+        <w:t xml:space="preserve">JOIN MATCH on </w:t>
+      </w:r>
+      <w:proofErr w:type="spellStart"/>
+      <w:r>
+        <w:rPr>
+          <w:color w:val="0070C0"/>
+          <w:sz w:val="22"/>
+          <w:szCs w:val="22"/>
+        </w:rPr>
+        <w:t>MATCH.id_reservation</w:t>
+      </w:r>
+      <w:proofErr w:type="spellEnd"/>
+      <w:r>
+        <w:rPr>
+          <w:color w:val="0070C0"/>
+          <w:sz w:val="22"/>
+          <w:szCs w:val="22"/>
+        </w:rPr>
+        <w:t xml:space="preserve"> = </w:t>
+      </w:r>
+      <w:proofErr w:type="spellStart"/>
+      <w:r>
+        <w:rPr>
+          <w:color w:val="0070C0"/>
+          <w:sz w:val="22"/>
+          <w:szCs w:val="22"/>
+        </w:rPr>
+        <w:t>RESERVATION.id_reservation</w:t>
+      </w:r>
+      <w:proofErr w:type="spellEnd"/>
+      <w:r>
+        <w:rPr>
+          <w:color w:val="0070C0"/>
+          <w:sz w:val="22"/>
+          <w:szCs w:val="22"/>
         </w:rPr>
         <w:br/>
-        <w:t xml:space="preserve">JOIN RESERVATION ON </w:t>
-      </w:r>
-      <w:proofErr w:type="spellStart"/>
-      <w:r>
-        <w:rPr>
-          <w:color w:val="0070C0"/>
-          <w:sz w:val="18"/>
-          <w:szCs w:val="18"/>
-        </w:rPr>
-        <w:t>MATCH.id_reservation</w:t>
-      </w:r>
-      <w:proofErr w:type="spellEnd"/>
-      <w:r>
-        <w:rPr>
-          <w:color w:val="0070C0"/>
-          <w:sz w:val="18"/>
-          <w:szCs w:val="18"/>
+        <w:t xml:space="preserve">JOIN ADHERENT_RESERVATION on </w:t>
+      </w:r>
+      <w:proofErr w:type="spellStart"/>
+      <w:r>
+        <w:rPr>
+          <w:color w:val="0070C0"/>
+          <w:sz w:val="22"/>
+          <w:szCs w:val="22"/>
+        </w:rPr>
+        <w:t>RESERVATION.id_reservation</w:t>
+      </w:r>
+      <w:proofErr w:type="spellEnd"/>
+      <w:r>
+        <w:rPr>
+          <w:color w:val="0070C0"/>
+          <w:sz w:val="22"/>
+          <w:szCs w:val="22"/>
         </w:rPr>
         <w:t xml:space="preserve"> = </w:t>
       </w:r>
@@ -1533,45 +1610,8 @@
       <w:r>
         <w:rPr>
           <w:color w:val="0070C0"/>
-          <w:sz w:val="18"/>
-          <w:szCs w:val="18"/>
-        </w:rPr>
-        <w:t>RESERVATION.id_reservation</w:t>
-      </w:r>
-      <w:proofErr w:type="spellEnd"/>
-      <w:r>
-        <w:rPr>
-          <w:color w:val="0070C0"/>
-          <w:sz w:val="18"/>
-          <w:szCs w:val="18"/>
-        </w:rPr>
-        <w:br/>
-        <w:t xml:space="preserve">JOIN ADHERENT_RESERVATION ON </w:t>
-      </w:r>
-      <w:proofErr w:type="spellStart"/>
-      <w:r>
-        <w:rPr>
-          <w:color w:val="0070C0"/>
-          <w:sz w:val="18"/>
-          <w:szCs w:val="18"/>
-        </w:rPr>
-        <w:t>RESERVATION.id_reservation</w:t>
-      </w:r>
-      <w:proofErr w:type="spellEnd"/>
-      <w:r>
-        <w:rPr>
-          <w:color w:val="0070C0"/>
-          <w:sz w:val="18"/>
-          <w:szCs w:val="18"/>
-        </w:rPr>
-        <w:t xml:space="preserve"> = </w:t>
-      </w:r>
-      <w:proofErr w:type="spellStart"/>
-      <w:r>
-        <w:rPr>
-          <w:color w:val="0070C0"/>
-          <w:sz w:val="18"/>
-          <w:szCs w:val="18"/>
+          <w:sz w:val="22"/>
+          <w:szCs w:val="22"/>
         </w:rPr>
         <w:t>ADHERENT_RESERVATION.id_reservation</w:t>
       </w:r>
@@ -1579,8 +1619,8 @@
       <w:r>
         <w:rPr>
           <w:color w:val="0070C0"/>
-          <w:sz w:val="18"/>
-          <w:szCs w:val="18"/>
+          <w:sz w:val="22"/>
+          <w:szCs w:val="22"/>
         </w:rPr>
         <w:br/>
         <w:t xml:space="preserve">WHERE </w:t>
@@ -1589,8 +1629,8 @@
       <w:r>
         <w:rPr>
           <w:color w:val="0070C0"/>
-          <w:sz w:val="18"/>
-          <w:szCs w:val="18"/>
+          <w:sz w:val="22"/>
+          <w:szCs w:val="22"/>
         </w:rPr>
         <w:t>ADHERENT_RESERVATION.id_adherent</w:t>
       </w:r>
@@ -1598,691 +1638,20 @@
       <w:r>
         <w:rPr>
           <w:color w:val="0070C0"/>
-          <w:sz w:val="18"/>
-          <w:szCs w:val="18"/>
-        </w:rPr>
-        <w:t xml:space="preserve"> = ?;</w:t>
+          <w:sz w:val="22"/>
+          <w:szCs w:val="22"/>
+        </w:rPr>
+        <w:t xml:space="preserve"> = ?;</w:t>
       </w:r>
     </w:p>
     <w:p>
       <w:pPr>
         <w:rPr>
           <w:color w:val="0070C0"/>
-          <w:sz w:val="18"/>
-          <w:szCs w:val="18"/>
+          <w:sz w:val="22"/>
+          <w:szCs w:val="22"/>
         </w:rPr>
       </w:pPr>
-      <w:r>
-        <w:rPr>
-          <w:color w:val="0070C0"/>
-          <w:sz w:val="22"/>
-          <w:szCs w:val="22"/>
-          <w:u w:val="single"/>
-        </w:rPr>
-        <w:t xml:space="preserve">Nombre </w:t>
-      </w:r>
-      <w:r>
-        <w:rPr>
-          <w:color w:val="0070C0"/>
-          <w:sz w:val="22"/>
-          <w:szCs w:val="22"/>
-          <w:u w:val="single"/>
-        </w:rPr>
-        <w:t>Défaite</w:t>
-      </w:r>
-      <w:r>
-        <w:rPr>
-          <w:color w:val="0070C0"/>
-          <w:sz w:val="22"/>
-          <w:szCs w:val="22"/>
-          <w:u w:val="single"/>
-        </w:rPr>
-        <w:t> :</w:t>
-      </w:r>
-      <w:r>
-        <w:rPr>
-          <w:color w:val="0070C0"/>
-          <w:sz w:val="22"/>
-          <w:szCs w:val="22"/>
-        </w:rPr>
-        <w:t xml:space="preserve"> </w:t>
-      </w:r>
-      <w:r>
-        <w:rPr>
-          <w:color w:val="0070C0"/>
-          <w:sz w:val="22"/>
-          <w:szCs w:val="22"/>
-        </w:rPr>
-        <w:br/>
-      </w:r>
-      <w:r>
-        <w:rPr>
-          <w:color w:val="0070C0"/>
-          <w:sz w:val="18"/>
-          <w:szCs w:val="18"/>
-        </w:rPr>
-        <w:t>SELECT SUM(MATCH.</w:t>
-      </w:r>
-      <w:r>
-        <w:rPr>
-          <w:rFonts w:ascii="TTCommonsPro-Rg" w:hAnsi="TTCommonsPro-Rg" w:cs="TTCommonsPro-Rg"/>
-          <w:kern w:val="0"/>
-          <w:sz w:val="11"/>
-          <w:szCs w:val="11"/>
-        </w:rPr>
-        <w:t xml:space="preserve"> </w:t>
-      </w:r>
-      <w:proofErr w:type="spellStart"/>
-      <w:r>
-        <w:rPr>
-          <w:color w:val="0070C0"/>
-          <w:sz w:val="18"/>
-          <w:szCs w:val="18"/>
-        </w:rPr>
-        <w:t>nb_defaites</w:t>
-      </w:r>
-      <w:proofErr w:type="spellEnd"/>
-      <w:r>
-        <w:rPr>
-          <w:color w:val="0070C0"/>
-          <w:sz w:val="18"/>
-          <w:szCs w:val="18"/>
-        </w:rPr>
-        <w:t xml:space="preserve">) AS </w:t>
-      </w:r>
-      <w:proofErr w:type="spellStart"/>
-      <w:r>
-        <w:rPr>
-          <w:color w:val="0070C0"/>
-          <w:sz w:val="18"/>
-          <w:szCs w:val="18"/>
-        </w:rPr>
-        <w:t>total_</w:t>
-      </w:r>
-      <w:r>
-        <w:rPr>
-          <w:color w:val="0070C0"/>
-          <w:sz w:val="18"/>
-          <w:szCs w:val="18"/>
-        </w:rPr>
-        <w:t>défaites</w:t>
-      </w:r>
-      <w:proofErr w:type="spellEnd"/>
-      <w:r>
-        <w:rPr>
-          <w:color w:val="0070C0"/>
-          <w:sz w:val="18"/>
-          <w:szCs w:val="18"/>
-        </w:rPr>
-        <w:t xml:space="preserve"> </w:t>
-      </w:r>
-      <w:r>
-        <w:rPr>
-          <w:color w:val="0070C0"/>
-          <w:sz w:val="18"/>
-          <w:szCs w:val="18"/>
-        </w:rPr>
-        <w:br/>
-      </w:r>
-      <w:r>
-        <w:rPr>
-          <w:color w:val="0070C0"/>
-          <w:sz w:val="18"/>
-          <w:szCs w:val="18"/>
-        </w:rPr>
-        <w:t>FROM MATCH</w:t>
-      </w:r>
-      <w:r>
-        <w:rPr>
-          <w:color w:val="0070C0"/>
-          <w:sz w:val="18"/>
-          <w:szCs w:val="18"/>
-        </w:rPr>
-        <w:br/>
-      </w:r>
-      <w:r>
-        <w:rPr>
-          <w:color w:val="0070C0"/>
-          <w:sz w:val="18"/>
-          <w:szCs w:val="18"/>
-        </w:rPr>
-        <w:t xml:space="preserve">JOIN RESERVATION ON </w:t>
-      </w:r>
-      <w:proofErr w:type="spellStart"/>
-      <w:r>
-        <w:rPr>
-          <w:color w:val="0070C0"/>
-          <w:sz w:val="18"/>
-          <w:szCs w:val="18"/>
-        </w:rPr>
-        <w:t>MATCH.id_reservation</w:t>
-      </w:r>
-      <w:proofErr w:type="spellEnd"/>
-      <w:r>
-        <w:rPr>
-          <w:color w:val="0070C0"/>
-          <w:sz w:val="18"/>
-          <w:szCs w:val="18"/>
-        </w:rPr>
-        <w:t xml:space="preserve"> = </w:t>
-      </w:r>
-      <w:proofErr w:type="spellStart"/>
-      <w:r>
-        <w:rPr>
-          <w:color w:val="0070C0"/>
-          <w:sz w:val="18"/>
-          <w:szCs w:val="18"/>
-        </w:rPr>
-        <w:t>RESERVATION.id_reservation</w:t>
-      </w:r>
-      <w:proofErr w:type="spellEnd"/>
-      <w:r>
-        <w:rPr>
-          <w:color w:val="0070C0"/>
-          <w:sz w:val="18"/>
-          <w:szCs w:val="18"/>
-        </w:rPr>
-        <w:br/>
-      </w:r>
-      <w:r>
-        <w:rPr>
-          <w:color w:val="0070C0"/>
-          <w:sz w:val="18"/>
-          <w:szCs w:val="18"/>
-        </w:rPr>
-        <w:t xml:space="preserve">JOIN ADHERENT_RESERVATION ON </w:t>
-      </w:r>
-      <w:proofErr w:type="spellStart"/>
-      <w:r>
-        <w:rPr>
-          <w:color w:val="0070C0"/>
-          <w:sz w:val="18"/>
-          <w:szCs w:val="18"/>
-        </w:rPr>
-        <w:t>RESERVATION.id_reservation</w:t>
-      </w:r>
-      <w:proofErr w:type="spellEnd"/>
-      <w:r>
-        <w:rPr>
-          <w:color w:val="0070C0"/>
-          <w:sz w:val="18"/>
-          <w:szCs w:val="18"/>
-        </w:rPr>
-        <w:t xml:space="preserve"> = </w:t>
-      </w:r>
-      <w:proofErr w:type="spellStart"/>
-      <w:r>
-        <w:rPr>
-          <w:color w:val="0070C0"/>
-          <w:sz w:val="18"/>
-          <w:szCs w:val="18"/>
-        </w:rPr>
-        <w:t>ADHERENT_RESERVATION.id_reservation</w:t>
-      </w:r>
-      <w:proofErr w:type="spellEnd"/>
-      <w:r>
-        <w:rPr>
-          <w:color w:val="0070C0"/>
-          <w:sz w:val="18"/>
-          <w:szCs w:val="18"/>
-        </w:rPr>
-        <w:br/>
-      </w:r>
-      <w:r>
-        <w:rPr>
-          <w:color w:val="0070C0"/>
-          <w:sz w:val="18"/>
-          <w:szCs w:val="18"/>
-        </w:rPr>
-        <w:t xml:space="preserve">WHERE </w:t>
-      </w:r>
-      <w:proofErr w:type="spellStart"/>
-      <w:r>
-        <w:rPr>
-          <w:color w:val="0070C0"/>
-          <w:sz w:val="18"/>
-          <w:szCs w:val="18"/>
-        </w:rPr>
-        <w:t>ADHERENT_RESERVATION.id_adherent</w:t>
-      </w:r>
-      <w:proofErr w:type="spellEnd"/>
-      <w:r>
-        <w:rPr>
-          <w:color w:val="0070C0"/>
-          <w:sz w:val="18"/>
-          <w:szCs w:val="18"/>
-        </w:rPr>
-        <w:t xml:space="preserve"> = ?;</w:t>
-      </w:r>
-    </w:p>
-    <w:p>
-      <w:pPr>
-        <w:rPr>
-          <w:color w:val="0070C0"/>
-          <w:sz w:val="22"/>
-          <w:szCs w:val="22"/>
-        </w:rPr>
-      </w:pPr>
-      <w:r>
-        <w:rPr>
-          <w:color w:val="0070C0"/>
-          <w:sz w:val="22"/>
-          <w:szCs w:val="22"/>
-          <w:u w:val="single"/>
-        </w:rPr>
-        <w:t xml:space="preserve">Nombre </w:t>
-      </w:r>
-      <w:r>
-        <w:rPr>
-          <w:color w:val="0070C0"/>
-          <w:sz w:val="22"/>
-          <w:szCs w:val="22"/>
-          <w:u w:val="single"/>
-        </w:rPr>
-        <w:t>Egalité</w:t>
-      </w:r>
-      <w:r>
-        <w:rPr>
-          <w:color w:val="0070C0"/>
-          <w:sz w:val="22"/>
-          <w:szCs w:val="22"/>
-          <w:u w:val="single"/>
-        </w:rPr>
-        <w:t> :</w:t>
-      </w:r>
-      <w:r>
-        <w:rPr>
-          <w:color w:val="0070C0"/>
-          <w:sz w:val="22"/>
-          <w:szCs w:val="22"/>
-        </w:rPr>
-        <w:t xml:space="preserve"> </w:t>
-      </w:r>
-      <w:r>
-        <w:rPr>
-          <w:color w:val="0070C0"/>
-          <w:sz w:val="22"/>
-          <w:szCs w:val="22"/>
-        </w:rPr>
-        <w:br/>
-      </w:r>
-      <w:r>
-        <w:rPr>
-          <w:color w:val="0070C0"/>
-          <w:sz w:val="18"/>
-          <w:szCs w:val="18"/>
-        </w:rPr>
-        <w:t>SELECT SUM(MATCH.</w:t>
-      </w:r>
-      <w:r>
-        <w:rPr>
-          <w:rFonts w:ascii="TTCommonsPro-Rg" w:hAnsi="TTCommonsPro-Rg" w:cs="TTCommonsPro-Rg"/>
-          <w:kern w:val="0"/>
-          <w:sz w:val="11"/>
-          <w:szCs w:val="11"/>
-        </w:rPr>
-        <w:t xml:space="preserve"> </w:t>
-      </w:r>
-      <w:proofErr w:type="spellStart"/>
-      <w:r>
-        <w:rPr>
-          <w:color w:val="0070C0"/>
-          <w:sz w:val="18"/>
-          <w:szCs w:val="18"/>
-        </w:rPr>
-        <w:t>nb_</w:t>
-      </w:r>
-      <w:r>
-        <w:rPr>
-          <w:color w:val="0070C0"/>
-          <w:sz w:val="18"/>
-          <w:szCs w:val="18"/>
-        </w:rPr>
-        <w:t>egalites</w:t>
-      </w:r>
-      <w:proofErr w:type="spellEnd"/>
-      <w:r>
-        <w:rPr>
-          <w:color w:val="0070C0"/>
-          <w:sz w:val="18"/>
-          <w:szCs w:val="18"/>
-        </w:rPr>
-        <w:t xml:space="preserve">) AS </w:t>
-      </w:r>
-      <w:proofErr w:type="spellStart"/>
-      <w:r>
-        <w:rPr>
-          <w:color w:val="0070C0"/>
-          <w:sz w:val="18"/>
-          <w:szCs w:val="18"/>
-        </w:rPr>
-        <w:t>total_</w:t>
-      </w:r>
-      <w:r>
-        <w:rPr>
-          <w:color w:val="0070C0"/>
-          <w:sz w:val="18"/>
-          <w:szCs w:val="18"/>
-        </w:rPr>
-        <w:t>egalites</w:t>
-      </w:r>
-      <w:proofErr w:type="spellEnd"/>
-      <w:r>
-        <w:rPr>
-          <w:color w:val="0070C0"/>
-          <w:sz w:val="18"/>
-          <w:szCs w:val="18"/>
-        </w:rPr>
-        <w:t xml:space="preserve"> </w:t>
-      </w:r>
-      <w:r>
-        <w:rPr>
-          <w:color w:val="0070C0"/>
-          <w:sz w:val="18"/>
-          <w:szCs w:val="18"/>
-        </w:rPr>
-        <w:br/>
-        <w:t>FROM MATCH</w:t>
-      </w:r>
-      <w:r>
-        <w:rPr>
-          <w:color w:val="0070C0"/>
-          <w:sz w:val="18"/>
-          <w:szCs w:val="18"/>
-        </w:rPr>
-        <w:br/>
-        <w:t xml:space="preserve">JOIN RESERVATION ON </w:t>
-      </w:r>
-      <w:proofErr w:type="spellStart"/>
-      <w:r>
-        <w:rPr>
-          <w:color w:val="0070C0"/>
-          <w:sz w:val="18"/>
-          <w:szCs w:val="18"/>
-        </w:rPr>
-        <w:t>MATCH.id_reservation</w:t>
-      </w:r>
-      <w:proofErr w:type="spellEnd"/>
-      <w:r>
-        <w:rPr>
-          <w:color w:val="0070C0"/>
-          <w:sz w:val="18"/>
-          <w:szCs w:val="18"/>
-        </w:rPr>
-        <w:t xml:space="preserve"> = </w:t>
-      </w:r>
-      <w:proofErr w:type="spellStart"/>
-      <w:r>
-        <w:rPr>
-          <w:color w:val="0070C0"/>
-          <w:sz w:val="18"/>
-          <w:szCs w:val="18"/>
-        </w:rPr>
-        <w:t>RESERVATION.id_reservation</w:t>
-      </w:r>
-      <w:proofErr w:type="spellEnd"/>
-      <w:r>
-        <w:rPr>
-          <w:color w:val="0070C0"/>
-          <w:sz w:val="18"/>
-          <w:szCs w:val="18"/>
-        </w:rPr>
-        <w:br/>
-        <w:t xml:space="preserve">JOIN ADHERENT_RESERVATION ON </w:t>
-      </w:r>
-      <w:proofErr w:type="spellStart"/>
-      <w:r>
-        <w:rPr>
-          <w:color w:val="0070C0"/>
-          <w:sz w:val="18"/>
-          <w:szCs w:val="18"/>
-        </w:rPr>
-        <w:t>RESERVATION.id_reservation</w:t>
-      </w:r>
-      <w:proofErr w:type="spellEnd"/>
-      <w:r>
-        <w:rPr>
-          <w:color w:val="0070C0"/>
-          <w:sz w:val="18"/>
-          <w:szCs w:val="18"/>
-        </w:rPr>
-        <w:t xml:space="preserve"> = </w:t>
-      </w:r>
-      <w:proofErr w:type="spellStart"/>
-      <w:r>
-        <w:rPr>
-          <w:color w:val="0070C0"/>
-          <w:sz w:val="18"/>
-          <w:szCs w:val="18"/>
-        </w:rPr>
-        <w:t>ADHERENT_RESERVATION.id_reservation</w:t>
-      </w:r>
-      <w:proofErr w:type="spellEnd"/>
-      <w:r>
-        <w:rPr>
-          <w:color w:val="0070C0"/>
-          <w:sz w:val="18"/>
-          <w:szCs w:val="18"/>
-        </w:rPr>
-        <w:br/>
-        <w:t xml:space="preserve">WHERE </w:t>
-      </w:r>
-      <w:proofErr w:type="spellStart"/>
-      <w:r>
-        <w:rPr>
-          <w:color w:val="0070C0"/>
-          <w:sz w:val="18"/>
-          <w:szCs w:val="18"/>
-        </w:rPr>
-        <w:t>ADHERENT_RESERVATION.id_adherent</w:t>
-      </w:r>
-      <w:proofErr w:type="spellEnd"/>
-      <w:r>
-        <w:rPr>
-          <w:color w:val="0070C0"/>
-          <w:sz w:val="18"/>
-          <w:szCs w:val="18"/>
-        </w:rPr>
-        <w:t xml:space="preserve"> = ?;</w:t>
-      </w:r>
-    </w:p>
-    <w:p>
-      <w:pPr>
-        <w:rPr>
-          <w:color w:val="0070C0"/>
-          <w:sz w:val="22"/>
-          <w:szCs w:val="22"/>
-        </w:rPr>
-      </w:pPr>
-    </w:p>
-    <w:p>
-      <w:pPr>
-        <w:rPr>
-          <w:color w:val="0070C0"/>
-          <w:sz w:val="22"/>
-          <w:szCs w:val="22"/>
-        </w:rPr>
-      </w:pPr>
-      <w:r>
-        <w:rPr>
-          <w:color w:val="0070C0"/>
-          <w:sz w:val="22"/>
-          <w:szCs w:val="22"/>
-        </w:rPr>
-        <w:t>--------------</w:t>
-      </w:r>
-      <w:r>
-        <w:rPr>
-          <w:color w:val="0070C0"/>
-          <w:sz w:val="22"/>
-          <w:szCs w:val="22"/>
-        </w:rPr>
-        <w:br/>
-      </w:r>
-      <w:r>
-        <w:rPr>
-          <w:color w:val="0070C0"/>
-          <w:sz w:val="22"/>
-          <w:szCs w:val="22"/>
-        </w:rPr>
-        <w:br/>
-        <w:t>Afficher tableaux de score :</w:t>
-      </w:r>
-      <w:r>
-        <w:rPr>
-          <w:color w:val="0070C0"/>
-          <w:sz w:val="22"/>
-          <w:szCs w:val="22"/>
-        </w:rPr>
-        <w:br/>
-        <w:t xml:space="preserve">SELECT </w:t>
-      </w:r>
-      <w:proofErr w:type="spellStart"/>
-      <w:r>
-        <w:rPr>
-          <w:color w:val="0070C0"/>
-          <w:sz w:val="22"/>
-          <w:szCs w:val="22"/>
-        </w:rPr>
-        <w:t>RESERVATION.date_reservation</w:t>
-      </w:r>
-      <w:proofErr w:type="spellEnd"/>
-      <w:r>
-        <w:rPr>
-          <w:color w:val="0070C0"/>
-          <w:sz w:val="22"/>
-          <w:szCs w:val="22"/>
-        </w:rPr>
-        <w:t>,</w:t>
-      </w:r>
-      <w:r>
-        <w:rPr>
-          <w:color w:val="0070C0"/>
-          <w:sz w:val="22"/>
-          <w:szCs w:val="22"/>
-        </w:rPr>
-        <w:t xml:space="preserve"> </w:t>
-      </w:r>
-      <w:proofErr w:type="spellStart"/>
-      <w:r>
-        <w:rPr>
-          <w:color w:val="0070C0"/>
-          <w:sz w:val="22"/>
-          <w:szCs w:val="22"/>
-        </w:rPr>
-        <w:t>MATCH.score</w:t>
-      </w:r>
-      <w:proofErr w:type="spellEnd"/>
-      <w:r>
-        <w:rPr>
-          <w:color w:val="0070C0"/>
-          <w:sz w:val="22"/>
-          <w:szCs w:val="22"/>
-        </w:rPr>
-        <w:br/>
-        <w:t>FROM RESERVATION</w:t>
-      </w:r>
-      <w:r>
-        <w:rPr>
-          <w:color w:val="0070C0"/>
-          <w:sz w:val="22"/>
-          <w:szCs w:val="22"/>
-        </w:rPr>
-        <w:br/>
-        <w:t xml:space="preserve">JOIN MATCH on </w:t>
-      </w:r>
-      <w:proofErr w:type="spellStart"/>
-      <w:r>
-        <w:rPr>
-          <w:color w:val="0070C0"/>
-          <w:sz w:val="22"/>
-          <w:szCs w:val="22"/>
-        </w:rPr>
-        <w:t>MATCH.id_reservation</w:t>
-      </w:r>
-      <w:proofErr w:type="spellEnd"/>
-      <w:r>
-        <w:rPr>
-          <w:color w:val="0070C0"/>
-          <w:sz w:val="22"/>
-          <w:szCs w:val="22"/>
-        </w:rPr>
-        <w:t xml:space="preserve"> = </w:t>
-      </w:r>
-      <w:proofErr w:type="spellStart"/>
-      <w:r>
-        <w:rPr>
-          <w:color w:val="0070C0"/>
-          <w:sz w:val="22"/>
-          <w:szCs w:val="22"/>
-        </w:rPr>
-        <w:t>RESERVATION.id_reservation</w:t>
-      </w:r>
-      <w:proofErr w:type="spellEnd"/>
-      <w:r>
-        <w:rPr>
-          <w:color w:val="0070C0"/>
-          <w:sz w:val="22"/>
-          <w:szCs w:val="22"/>
-        </w:rPr>
-        <w:br/>
-        <w:t xml:space="preserve">JOIN ADHERENT_RESERVATION on </w:t>
-      </w:r>
-      <w:proofErr w:type="spellStart"/>
-      <w:r>
-        <w:rPr>
-          <w:color w:val="0070C0"/>
-          <w:sz w:val="22"/>
-          <w:szCs w:val="22"/>
-        </w:rPr>
-        <w:t>RESERVATION.id_reservation</w:t>
-      </w:r>
-      <w:proofErr w:type="spellEnd"/>
-      <w:r>
-        <w:rPr>
-          <w:color w:val="0070C0"/>
-          <w:sz w:val="22"/>
-          <w:szCs w:val="22"/>
-        </w:rPr>
-        <w:t xml:space="preserve"> = </w:t>
-      </w:r>
-      <w:proofErr w:type="spellStart"/>
-      <w:r>
-        <w:rPr>
-          <w:color w:val="0070C0"/>
-          <w:sz w:val="22"/>
-          <w:szCs w:val="22"/>
-        </w:rPr>
-        <w:t>ADHERENT_RESERVATION.id_reservation</w:t>
-      </w:r>
-      <w:proofErr w:type="spellEnd"/>
-      <w:r>
-        <w:rPr>
-          <w:color w:val="0070C0"/>
-          <w:sz w:val="22"/>
-          <w:szCs w:val="22"/>
-        </w:rPr>
-        <w:br/>
-        <w:t xml:space="preserve">WHERE </w:t>
-      </w:r>
-      <w:proofErr w:type="spellStart"/>
-      <w:r>
-        <w:rPr>
-          <w:color w:val="0070C0"/>
-          <w:sz w:val="22"/>
-          <w:szCs w:val="22"/>
-        </w:rPr>
-        <w:t>ADHERENT_RESERVATION.id_adherent</w:t>
-      </w:r>
-      <w:proofErr w:type="spellEnd"/>
-      <w:r>
-        <w:rPr>
-          <w:color w:val="0070C0"/>
-          <w:sz w:val="22"/>
-          <w:szCs w:val="22"/>
-        </w:rPr>
-        <w:t xml:space="preserve"> = ?;</w:t>
-      </w:r>
     </w:p>
     <w:sectPr>
       <w:pgSz w:w="11906" w:h="16838"/>

</xml_diff>